<commit_message>
correction détection des doublons
</commit_message>
<xml_diff>
--- a/uploads/f5ba05cb-a187-49f5-913b-340770b0e8c0/accords/Accord_Mission_CoralIO.docx
+++ b/uploads/f5ba05cb-a187-49f5-913b-340770b0e8c0/accords/Accord_Mission_CoralIO.docx
@@ -152,23 +152,13 @@
             <w:pPr>
               <w:jc w:val="right"/>
             </w:pPr>
-            <w:proofErr w:type="gramStart"/>
             <w:r>
               <w:rPr>
                 <w:color w:val="7F8C8D"/>
                 <w:sz w:val="17"/>
                 <w:szCs w:val="17"/>
               </w:rPr>
-              <w:t>contact@coralio.com  |</w:t>
-            </w:r>
-            <w:proofErr w:type="gramEnd"/>
-            <w:r>
-              <w:rPr>
-                <w:color w:val="7F8C8D"/>
-                <w:sz w:val="17"/>
-                <w:szCs w:val="17"/>
-              </w:rPr>
-              <w:t xml:space="preserve">  Tel : </w:t>
+              <w:t xml:space="preserve">contact@coralio.com  |  Tel : </w:t>
             </w:r>
             <w:r>
               <w:rPr>
@@ -188,7 +178,7 @@
                 <w:sz w:val="16"/>
                 <w:szCs w:val="16"/>
               </w:rPr>
-              <w:t>33</w:t>
+              <w:t>216</w:t>
             </w:r>
             <w:r>
               <w:rPr>
@@ -246,7 +236,7 @@
     </w:p>
     <w:tbl>
       <w:tblPr>
-        <w:tblW w:w="9360" w:type="dxa"/>
+        <w:tblW w:w="9918" w:type="dxa"/>
         <w:tblBorders>
           <w:top w:val="single" w:sz="4" w:space="0" w:color="auto"/>
           <w:left w:val="single" w:sz="4" w:space="0" w:color="auto"/>
@@ -263,7 +253,7 @@
       </w:tblPr>
       <w:tblGrid>
         <w:gridCol w:w="4680"/>
-        <w:gridCol w:w="4680"/>
+        <w:gridCol w:w="5238"/>
       </w:tblGrid>
       <w:tr>
         <w:tc>
@@ -296,11 +286,15 @@
               <w:t>Nom &amp; Prénom :</w:t>
             </w:r>
           </w:p>
-          <w:p/>
+          <w:p>
+            <w:r>
+              <w:t>BOULARES MANEL</w:t>
+            </w:r>
+          </w:p>
         </w:tc>
         <w:tc>
           <w:tcPr>
-            <w:tcW w:w="4680" w:type="dxa"/>
+            <w:tcW w:w="5238" w:type="dxa"/>
             <w:tcBorders>
               <w:top w:val="single" w:sz="4" w:space="0" w:color="D5D8DC"/>
               <w:left w:val="single" w:sz="4" w:space="0" w:color="D5D8DC"/>
@@ -330,7 +324,13 @@
           </w:p>
           <w:p>
             <w:r>
-              <w:t>1234</w:t>
+              <w:t>MB</w:t>
+            </w:r>
+            <w:r>
+              <w:t>-</w:t>
+            </w:r>
+            <w:r>
+              <w:t>071</w:t>
             </w:r>
           </w:p>
         </w:tc>
@@ -368,13 +368,13 @@
           </w:p>
           <w:p>
             <w:r>
-              <w:t>Informatique</w:t>
+              <w:t>SEG</w:t>
             </w:r>
           </w:p>
         </w:tc>
         <w:tc>
           <w:tcPr>
-            <w:tcW w:w="4680" w:type="dxa"/>
+            <w:tcW w:w="5238" w:type="dxa"/>
             <w:tcBorders>
               <w:top w:val="single" w:sz="4" w:space="0" w:color="D5D8DC"/>
               <w:left w:val="single" w:sz="4" w:space="0" w:color="D5D8DC"/>
@@ -433,7 +433,7 @@
     </w:p>
     <w:tbl>
       <w:tblPr>
-        <w:tblW w:w="9360" w:type="dxa"/>
+        <w:tblW w:w="9918" w:type="dxa"/>
         <w:tblBorders>
           <w:top w:val="single" w:sz="4" w:space="0" w:color="auto"/>
           <w:left w:val="single" w:sz="4" w:space="0" w:color="auto"/>
@@ -449,12 +449,12 @@
         <w:tblLook w:val="0000" w:firstRow="0" w:lastRow="0" w:firstColumn="0" w:lastColumn="0" w:noHBand="0" w:noVBand="0"/>
       </w:tblPr>
       <w:tblGrid>
-        <w:gridCol w:w="9360"/>
+        <w:gridCol w:w="9918"/>
       </w:tblGrid>
       <w:tr>
         <w:tc>
           <w:tcPr>
-            <w:tcW w:w="9360" w:type="dxa"/>
+            <w:tcW w:w="9918" w:type="dxa"/>
             <w:tcBorders>
               <w:top w:val="single" w:sz="4" w:space="0" w:color="D5D8DC"/>
               <w:left w:val="single" w:sz="4" w:space="0" w:color="D5D8DC"/>
@@ -492,7 +492,7 @@
       <w:tr>
         <w:tc>
           <w:tcPr>
-            <w:tcW w:w="9360" w:type="dxa"/>
+            <w:tcW w:w="9918" w:type="dxa"/>
             <w:tcBorders>
               <w:top w:val="single" w:sz="4" w:space="0" w:color="D5D8DC"/>
               <w:left w:val="single" w:sz="4" w:space="0" w:color="D5D8DC"/>
@@ -564,91 +564,16 @@
               </w:rPr>
               <w:t xml:space="preserve"> en France dans l’utilisation de notre nouvelle plateforme.</w:t>
             </w:r>
-            <w:r>
-              <w:rPr>
-                <w:rFonts w:ascii="Arial" w:eastAsia="Arial" w:hAnsi="Arial" w:cs="Arial"/>
-                <w:color w:val="2C3E50"/>
-                <w:sz w:val="22"/>
-                <w:szCs w:val="22"/>
-              </w:rPr>
-              <w:br/>
-            </w:r>
-            <w:r>
-              <w:rPr>
-                <w:rFonts w:ascii="Arial" w:eastAsia="Arial" w:hAnsi="Arial" w:cs="Arial"/>
-                <w:color w:val="2C3E50"/>
-                <w:sz w:val="22"/>
-                <w:szCs w:val="22"/>
-              </w:rPr>
-              <w:t xml:space="preserve">Lorem ipsum </w:t>
-            </w:r>
-            <w:proofErr w:type="spellStart"/>
-            <w:r>
-              <w:rPr>
-                <w:rFonts w:ascii="Arial" w:eastAsia="Arial" w:hAnsi="Arial" w:cs="Arial"/>
-                <w:color w:val="2C3E50"/>
-                <w:sz w:val="22"/>
-                <w:szCs w:val="22"/>
-              </w:rPr>
-              <w:t>dolor</w:t>
-            </w:r>
-            <w:proofErr w:type="spellEnd"/>
-            <w:r>
-              <w:rPr>
-                <w:rFonts w:ascii="Arial" w:eastAsia="Arial" w:hAnsi="Arial" w:cs="Arial"/>
-                <w:color w:val="2C3E50"/>
-                <w:sz w:val="22"/>
-                <w:szCs w:val="22"/>
-              </w:rPr>
-              <w:t xml:space="preserve"> </w:t>
-            </w:r>
-            <w:proofErr w:type="spellStart"/>
-            <w:r>
-              <w:rPr>
-                <w:rFonts w:ascii="Arial" w:eastAsia="Arial" w:hAnsi="Arial" w:cs="Arial"/>
-                <w:color w:val="2C3E50"/>
-                <w:sz w:val="22"/>
-                <w:szCs w:val="22"/>
-              </w:rPr>
-              <w:t>sit</w:t>
-            </w:r>
-            <w:proofErr w:type="spellEnd"/>
-            <w:r>
-              <w:rPr>
-                <w:rFonts w:ascii="Arial" w:eastAsia="Arial" w:hAnsi="Arial" w:cs="Arial"/>
-                <w:color w:val="2C3E50"/>
-                <w:sz w:val="22"/>
-                <w:szCs w:val="22"/>
-              </w:rPr>
-              <w:t xml:space="preserve"> </w:t>
-            </w:r>
-            <w:proofErr w:type="spellStart"/>
-            <w:r>
-              <w:rPr>
-                <w:rFonts w:ascii="Arial" w:eastAsia="Arial" w:hAnsi="Arial" w:cs="Arial"/>
-                <w:color w:val="2C3E50"/>
-                <w:sz w:val="22"/>
-                <w:szCs w:val="22"/>
-              </w:rPr>
-              <w:t>amet</w:t>
-            </w:r>
-            <w:proofErr w:type="spellEnd"/>
-            <w:r>
-              <w:rPr>
-                <w:rFonts w:ascii="Arial" w:eastAsia="Arial" w:hAnsi="Arial" w:cs="Arial"/>
-                <w:color w:val="2C3E50"/>
-                <w:sz w:val="22"/>
-                <w:szCs w:val="22"/>
-              </w:rPr>
-              <w:t>...</w:t>
-            </w:r>
           </w:p>
         </w:tc>
       </w:tr>
       <w:tr>
+        <w:trPr>
+          <w:trHeight w:val="551"/>
+        </w:trPr>
         <w:tc>
           <w:tcPr>
-            <w:tcW w:w="9360" w:type="dxa"/>
+            <w:tcW w:w="9918" w:type="dxa"/>
             <w:tcBorders>
               <w:top w:val="single" w:sz="4" w:space="0" w:color="D5D8DC"/>
               <w:left w:val="single" w:sz="4" w:space="0" w:color="D5D8DC"/>
@@ -666,26 +591,48 @@
           <w:p>
             <w:pPr>
               <w:spacing w:after="40"/>
-            </w:pPr>
-            <w:r>
               <w:rPr>
                 <w:b/>
                 <w:bCs/>
                 <w:color w:val="C0392B"/>
               </w:rPr>
-              <w:t xml:space="preserve">Lieu : </w:t>
-            </w:r>
-            <w:r>
-              <w:t>Turquie</w:t>
-            </w:r>
-          </w:p>
-          <w:p/>
+            </w:pPr>
+            <w:r>
+              <w:rPr>
+                <w:b/>
+                <w:bCs/>
+                <w:color w:val="C0392B"/>
+              </w:rPr>
+              <w:t>Projet</w:t>
+            </w:r>
+            <w:r>
+              <w:rPr>
+                <w:b/>
+                <w:bCs/>
+                <w:color w:val="C0392B"/>
+              </w:rPr>
+              <w:t xml:space="preserve"> : </w:t>
+            </w:r>
+          </w:p>
+          <w:p>
+            <w:pPr>
+              <w:spacing w:after="40"/>
+              <w:rPr>
+                <w:b/>
+                <w:bCs/>
+                <w:color w:val="C0392B"/>
+              </w:rPr>
+            </w:pPr>
+            <w:r>
+              <w:t>Former nos experts en France dans l’utilisation de notre nouvelle plateforme.</w:t>
+            </w:r>
+          </w:p>
         </w:tc>
       </w:tr>
       <w:tr>
         <w:tc>
           <w:tcPr>
-            <w:tcW w:w="9360" w:type="dxa"/>
+            <w:tcW w:w="9918" w:type="dxa"/>
             <w:tcBorders>
               <w:top w:val="single" w:sz="4" w:space="0" w:color="D5D8DC"/>
               <w:left w:val="single" w:sz="4" w:space="0" w:color="D5D8DC"/>
@@ -710,11 +657,46 @@
                 <w:bCs/>
                 <w:color w:val="C0392B"/>
               </w:rPr>
+              <w:t xml:space="preserve">Lieu : </w:t>
+            </w:r>
+            <w:r>
+              <w:t>Tunis</w:t>
+            </w:r>
+          </w:p>
+        </w:tc>
+      </w:tr>
+      <w:tr>
+        <w:tc>
+          <w:tcPr>
+            <w:tcW w:w="9918" w:type="dxa"/>
+            <w:tcBorders>
+              <w:top w:val="single" w:sz="4" w:space="0" w:color="D5D8DC"/>
+              <w:left w:val="single" w:sz="4" w:space="0" w:color="D5D8DC"/>
+              <w:bottom w:val="single" w:sz="4" w:space="0" w:color="D5D8DC"/>
+              <w:right w:val="single" w:sz="4" w:space="0" w:color="D5D8DC"/>
+            </w:tcBorders>
+            <w:tcMar>
+              <w:top w:w="120" w:type="dxa"/>
+              <w:left w:w="160" w:type="dxa"/>
+              <w:bottom w:w="120" w:type="dxa"/>
+              <w:right w:w="160" w:type="dxa"/>
+            </w:tcMar>
+            <w:vAlign w:val="center"/>
+          </w:tcPr>
+          <w:p>
+            <w:pPr>
+              <w:spacing w:after="40"/>
+            </w:pPr>
+            <w:r>
+              <w:rPr>
+                <w:b/>
+                <w:bCs/>
+                <w:color w:val="C0392B"/>
+              </w:rPr>
               <w:t>Dates :</w:t>
             </w:r>
           </w:p>
           <w:p>
-            <w:proofErr w:type="gramStart"/>
             <w:r>
               <w:t xml:space="preserve">du </w:t>
             </w:r>
@@ -722,14 +704,10 @@
               <w:t xml:space="preserve"> </w:t>
             </w:r>
             <w:r>
-              <w:t>9</w:t>
-            </w:r>
-            <w:proofErr w:type="gramEnd"/>
-            <w:r>
-              <w:t>/4/2026  au 13/6/202</w:t>
-            </w:r>
-            <w:r>
-              <w:t>5</w:t>
+              <w:t>9/4/2026  au 13/6/202</w:t>
+            </w:r>
+            <w:r>
+              <w:t>6</w:t>
             </w:r>
           </w:p>
         </w:tc>
@@ -758,7 +736,7 @@
     </w:p>
     <w:tbl>
       <w:tblPr>
-        <w:tblW w:w="9418" w:type="dxa"/>
+        <w:tblW w:w="9918" w:type="dxa"/>
         <w:tblBorders>
           <w:top w:val="single" w:sz="4" w:space="0" w:color="auto"/>
           <w:left w:val="single" w:sz="4" w:space="0" w:color="auto"/>
@@ -775,7 +753,7 @@
       </w:tblPr>
       <w:tblGrid>
         <w:gridCol w:w="4709"/>
-        <w:gridCol w:w="4709"/>
+        <w:gridCol w:w="5209"/>
       </w:tblGrid>
       <w:tr>
         <w:trPr>
@@ -812,13 +790,8 @@
             </w:r>
           </w:p>
           <w:p>
-            <w:proofErr w:type="spellStart"/>
-            <w:r>
-              <w:t>Boulares</w:t>
-            </w:r>
-            <w:proofErr w:type="spellEnd"/>
-            <w:r>
-              <w:t xml:space="preserve"> Manel</w:t>
+            <w:r>
+              <w:t>Jemai Ghofrane</w:t>
             </w:r>
           </w:p>
           <w:p>
@@ -871,7 +844,7 @@
         </w:tc>
         <w:tc>
           <w:tcPr>
-            <w:tcW w:w="4709" w:type="dxa"/>
+            <w:tcW w:w="5209" w:type="dxa"/>
             <w:tcBorders>
               <w:top w:val="single" w:sz="4" w:space="0" w:color="D5D8DC"/>
               <w:left w:val="single" w:sz="4" w:space="0" w:color="D5D8DC"/>
@@ -904,15 +877,15 @@
                 <w:noProof/>
               </w:rPr>
               <w:drawing>
-                <wp:anchor distT="0" distB="0" distL="114300" distR="114300" simplePos="0" relativeHeight="251658240" behindDoc="0" locked="0" layoutInCell="1" allowOverlap="1" wp14:anchorId="507FDE48" wp14:editId="7ECF05B7">
+                <wp:anchor distT="0" distB="0" distL="114300" distR="114300" simplePos="0" relativeHeight="251658240" behindDoc="0" locked="0" layoutInCell="1" allowOverlap="1" wp14:anchorId="507FDE48" wp14:editId="139F02AF">
                   <wp:simplePos x="0" y="0"/>
                   <wp:positionH relativeFrom="column">
-                    <wp:posOffset>227965</wp:posOffset>
+                    <wp:posOffset>224155</wp:posOffset>
                   </wp:positionH>
                   <wp:positionV relativeFrom="paragraph">
-                    <wp:posOffset>187960</wp:posOffset>
+                    <wp:posOffset>184150</wp:posOffset>
                   </wp:positionV>
-                  <wp:extent cx="2308860" cy="1027430"/>
+                  <wp:extent cx="2790825" cy="1242060"/>
                   <wp:effectExtent l="0" t="0" r="0" b="0"/>
                   <wp:wrapSquare wrapText="bothSides"/>
                   <wp:docPr id="2" name="Picture 2"/>
@@ -944,7 +917,7 @@
                         <pic:spPr bwMode="auto">
                           <a:xfrm>
                             <a:off x="0" y="0"/>
-                            <a:ext cx="2308860" cy="1027430"/>
+                            <a:ext cx="2790825" cy="1242060"/>
                           </a:xfrm>
                           <a:prstGeom prst="rect">
                             <a:avLst/>
@@ -970,11 +943,6 @@
         </w:tc>
       </w:tr>
     </w:tbl>
-    <w:p>
-      <w:pPr>
-        <w:spacing w:after="80"/>
-      </w:pPr>
-    </w:p>
     <w:p>
       <w:pPr>
         <w:spacing w:before="240" w:after="200"/>
@@ -1025,7 +993,7 @@
           <w:sz w:val="16"/>
           <w:szCs w:val="16"/>
         </w:rPr>
-        <w:t>999</w:t>
+        <w:t>216</w:t>
       </w:r>
       <w:r>
         <w:rPr>
@@ -1540,6 +1508,7 @@
   <w:style w:type="paragraph" w:default="1" w:styleId="Normal">
     <w:name w:val="Normal"/>
     <w:qFormat/>
+    <w:rsid w:val="00E77139"/>
   </w:style>
   <w:style w:type="paragraph" w:styleId="Heading1">
     <w:name w:val="heading 1"/>

</xml_diff>